<commit_message>
feat: Add user approval and rejection email & in-app notifications
</commit_message>
<xml_diff>
--- a/Chapter_7_Conclusion_and_Future_Work.docx
+++ b/Chapter_7_Conclusion_and_Future_Work.docx
@@ -510,6 +510,86 @@
       </w:r>
       <w:r>
         <w:t xml:space="preserve">The SMS gateway integration is unidirectional. While farmers receive text alerts when a buyer submits an inquiry, they cannot respond to the text message or execute transaction options offline.</w:t>
+      </w:r>
+    </w:p>
+    <w:p>
+      <w:pPr>
+        <w:pStyle w:val="ListParagraph"/>
+        <w:numPr>
+          <w:ilvl w:val="0"/>
+          <w:numId w:val="1"/>
+        </w:numPr>
+        <w:spacing w:after="80" w:before="50"/>
+      </w:pPr>
+      <w:r>
+        <w:rPr>
+          <w:b/>
+          <w:bCs/>
+        </w:rPr>
+        <w:t xml:space="preserve">Absence of Integrated Payment Gateway &amp; Escrow Service: </w:t>
+      </w:r>
+      <w:r>
+        <w:t xml:space="preserve">The platform currently records rental rates and crop listing prices, but does not process live monetary transactions. Payment fulfillment relies on offline cash-on-delivery or manual bank transfers between farmers and buyers, leaving transactions vulnerable to payment default or pricing disputes.</w:t>
+      </w:r>
+    </w:p>
+    <w:p>
+      <w:pPr>
+        <w:pStyle w:val="ListParagraph"/>
+        <w:numPr>
+          <w:ilvl w:val="0"/>
+          <w:numId w:val="1"/>
+        </w:numPr>
+        <w:spacing w:after="80" w:before="50"/>
+      </w:pPr>
+      <w:r>
+        <w:rPr>
+          <w:b/>
+          <w:bCs/>
+        </w:rPr>
+        <w:t xml:space="preserve">In-Memory WebSocket Single-Node Scaling Restriction: </w:t>
+      </w:r>
+      <w:r>
+        <w:t xml:space="preserve">The Socket.IO real-time chat engine manages active client connections in-memory on a single backend instance. In a load-balanced server environment, users connected to different server instances cannot exchange real-time messages without implementing a Redis pub/sub adapter layer.</w:t>
+      </w:r>
+    </w:p>
+    <w:p>
+      <w:pPr>
+        <w:pStyle w:val="ListParagraph"/>
+        <w:numPr>
+          <w:ilvl w:val="0"/>
+          <w:numId w:val="1"/>
+        </w:numPr>
+        <w:spacing w:after="80" w:before="50"/>
+      </w:pPr>
+      <w:r>
+        <w:rPr>
+          <w:b/>
+          <w:bCs/>
+        </w:rPr>
+        <w:t xml:space="preserve">Stateless JWT Revocation Lag: </w:t>
+      </w:r>
+      <w:r>
+        <w:t xml:space="preserve">User authentication utilizes stateless JSON Web Tokens (JWT). When an administrator revokes user access or when a user logs out, the issued token remains cryptographically valid until its hardcoded expiration time (1 hour), unless a centralized token blacklist is queried on every incoming API request.</w:t>
+      </w:r>
+    </w:p>
+    <w:p>
+      <w:pPr>
+        <w:pStyle w:val="ListParagraph"/>
+        <w:numPr>
+          <w:ilvl w:val="0"/>
+          <w:numId w:val="1"/>
+        </w:numPr>
+        <w:spacing w:after="80" w:before="50"/>
+      </w:pPr>
+      <w:r>
+        <w:rPr>
+          <w:b/>
+          <w:bCs/>
+        </w:rPr>
+        <w:t xml:space="preserve">Synchronous Cryptographic Hash Calculation: </w:t>
+      </w:r>
+      <w:r>
+        <w:t xml:space="preserve">Ledger block hashing (SHA-256) is executed synchronously inside Express request handlers. Under heavy concurrent rental confirmation traffic, computing cryptographic hashes synchronously within the main Node.js event loop could introduce minor response latency.</w:t>
       </w:r>
     </w:p>
     <w:p>

</xml_diff>